<commit_message>
Graph microwave encoder experiment; proxy variant table on dashboard; inner-core box relabelled 16 x 16 px (~70 km)
</commit_message>
<xml_diff>
--- a/docs/milton_da_technical_report.docx
+++ b/docs/milton_da_technical_report.docx
@@ -13258,7 +13258,7 @@
           <w:sz w:val="20"/>
           <w:szCs w:val="20"/>
         </w:rPr>
-        <w:t xml:space="preserve">Table 12. Per-scene verification of the 8-member analysis against ERA5 and IMERG. Core: RMSE at 300 hPa in a 130 km box around the best-track centre. Domain: mean over ten levels on the 128 x 128 grid. Warm core (WC) at 300 hPa in K. Two scenes have gaps in the labels and are not scored.</w:t>
+        <w:t xml:space="preserve">Table 12. Per-scene verification of the 8-member analysis against ERA5 and IMERG. Core: RMSE at 300 hPa in a central 16 x 16 pixel box (about 70 km at 4.4 km per pixel) around the best-track centre. Domain: mean over ten levels on the 128 x 128 grid. Warm core (WC) at 300 hPa in K. Two scenes have gaps in the labels and are not scored.</w:t>
       </w:r>
     </w:p>
     <w:tbl>
@@ -18338,7 +18338,7 @@
           <w:sz w:val="20"/>
           <w:szCs w:val="20"/>
         </w:rPr>
-        <w:t xml:space="preserve">Figure 9. Inner-core temperature RMSE at 300 hPa (130 km box) against ERA5 on the eight scenes with an ATMS overpass, for the full analysis, the direct U-Net proxy alone, and the physics-only microwave retrieval.</w:t>
+        <w:t xml:space="preserve">Figure 9. Inner-core temperature RMSE at 300 hPa (central 16 x 16 pixels, about 70 km) against ERA5 on the eight scenes with an ATMS overpass, for the full analysis, the direct U-Net proxy alone, and the physics-only microwave retrieval.</w:t>
       </w:r>
     </w:p>
     <w:p>
@@ -19500,7 +19500,7 @@
           <w:sz w:val="24"/>
           <w:szCs w:val="24"/>
         </w:rPr>
-        <w:t xml:space="preserve">Six figures computed on the page from the embedded results. Domain temperature RMSE against ERA5: the range across the 14 scored scenes of the root mean square difference between the 8-member mean temperature and ERA5, over all ten levels and the full 128 x 128 grid. Inner-core RMSE at 300 hPa: the same quantity at one level in an 8 x 8 box of the coarsened field, about 130 km around the best-track centre. Scenes with the warm core peaking at 250 to 400 hPa: a count of scenes whose warm-core profile has its maximum at one of those three levels. ATMS sounding-channel misfit after calibration: the root mean square difference between the bias-corrected simulated radiances of the analysis and the observed ones over channels 5 to 9, quoted with the value the ERA5 truth itself achieves so that the reader knows the floor. Analysis times with an ATMS overpass: scenes where the swath mask covers more than 30 percent of the domain. Training and validation scenes. The note beneath states the climatological caveat of Section 13.4 so that the domain RMSE is not over-read.</w:t>
+        <w:t xml:space="preserve">Six figures computed on the page from the embedded results. Domain temperature RMSE against ERA5: the range across the 14 scored scenes of the root mean square difference between the 8-member mean temperature and ERA5, over all ten levels and the full 128 x 128 grid. Inner-core RMSE at 300 hPa: the same quantity at one level in an 8 x 8 box of the coarsened field, about 70 km around the best-track centre. Scenes with the warm core peaking at 250 to 400 hPa: a count of scenes whose warm-core profile has its maximum at one of those three levels. ATMS sounding-channel misfit after calibration: the root mean square difference between the bias-corrected simulated radiances of the analysis and the observed ones over channels 5 to 9, quoted with the value the ERA5 truth itself achieves so that the reader knows the floor. Analysis times with an ATMS overpass: scenes where the swath mask covers more than 30 percent of the domain. Training and validation scenes. The note beneath states the climatological caveat of Section 13.4 so that the domain RMSE is not over-read.</w:t>
       </w:r>
     </w:p>
     <w:p>
@@ -29237,7 +29237,7 @@
                 <w:sz w:val="20"/>
                 <w:szCs w:val="20"/>
               </w:rPr>
-              <w:t xml:space="preserve">RMSE inside a 130 km box around the eye, where the warm core is and where a hurricane retrieval is actually tested.</w:t>
+              <w:t xml:space="preserve">RMSE inside a central 16 x 16 pixel box, about 70 km across around the eye, where the warm core is and where a hurricane retrieval is actually tested.</w:t>
             </w:r>
           </w:p>
         </w:tc>

</xml_diff>